<commit_message>
Citar projeto sempre como Nome (id)
ID solto não diz nada para quem lê o relatório, e nome sem ID não dá como
abrir o work item. A regra vira explícita nas instruções e vale em toda
menção — dashboard, deep dive, rascunho de Teams e confirmação antes de
gravar no DevOps, que era justamente onde só o número aparecia.

Formato sem #, o mesmo que o agente já produz naturalmente.

O playbook usava (#1234) num exemplo, contradizendo a regra. Corrigido e
o formato passou a ser ensinado na seção de anatomia da análise, já que é
a camada que o agente consulta para saber como estruturar o relatório.

Instruções: 6.367 -> 6.657 de ~8.000.

Co-Authored-By: Claude Opus 5 <noreply@anthropic.com>
Claude-Session: https://claude.ai/code/session_019ndNjexg4VzCxPyapMwe4S
</commit_message>
<xml_diff>
--- a/playbook/AURA_Playbook_Analitico.docx
+++ b/playbook/AURA_Playbook_Analitico.docx
@@ -4856,7 +4856,7 @@
         <w:t>Assimetria:</w:t>
       </w:r>
       <w:r>
-        <w:t xml:space="preserve"> [Projeto X] (#1234) tem o maior benefício do recorte e está travado por uma única aprovação de custo.</w:t>
+        <w:t xml:space="preserve"> [Projeto X] (1234) tem o maior benefício do recorte e está travado por uma única aprovação de custo.</w:t>
       </w:r>
     </w:p>
     <w:p>
@@ -4968,6 +4968,20 @@
       </w:r>
     </w:p>
     <w:p>
+      <w:r>
+        <w:t xml:space="preserve">Todo projeto citado, em qualquer seção, sai como </w:t>
+      </w:r>
+      <w:r>
+        <w:rPr>
+          <w:b/>
+        </w:rPr>
+        <w:t>`Nome do Projeto (1234)`</w:t>
+      </w:r>
+      <w:r>
+        <w:t xml:space="preserve"> — nome primeiro, ID do work item entre parênteses. Nunca o ID sozinho, nunca o nome sem o ID.</w:t>
+      </w:r>
+    </w:p>
+    <w:p>
       <w:pPr>
         <w:pStyle w:val="IntenseQuote"/>
       </w:pPr>
@@ -5072,6 +5086,14 @@
       </w:pPr>
       <w:r>
         <w:t>Recomendação sem responsável e sem prazo</w:t>
+      </w:r>
+    </w:p>
+    <w:p>
+      <w:pPr>
+        <w:pStyle w:val="ListBullet"/>
+      </w:pPr>
+      <w:r>
+        <w:t>ID de work item solto, sem o nome do projeto ao lado</w:t>
       </w:r>
     </w:p>
     <w:p>

</xml_diff>